<commit_message>
added the commentary to Q3 Bonus
</commit_message>
<xml_diff>
--- a/A1 Bakery Sales report - Group 6.docx
+++ b/A1 Bakery Sales report - Group 6.docx
@@ -776,6 +776,7 @@
       </w:pPr>
       <w:r>
         <w:rPr>
+          <w:noProof/>
           <w:sz w:val="20"/>
           <w:szCs w:val="20"/>
         </w:rPr>
@@ -1138,6 +1139,95 @@
         <w:rPr>
           <w:sz w:val="20"/>
           <w:szCs w:val="20"/>
+          <w:lang w:eastAsia="zh-CN"/>
+        </w:rPr>
+      </w:pPr>
+      <w:r>
+        <w:rPr>
+          <w:rFonts w:hint="eastAsia"/>
+          <w:sz w:val="20"/>
+          <w:szCs w:val="20"/>
+          <w:lang w:eastAsia="zh-CN"/>
+        </w:rPr>
+        <w:t xml:space="preserve">We attempted to </w:t>
+      </w:r>
+      <w:r>
+        <w:rPr>
+          <w:sz w:val="20"/>
+          <w:szCs w:val="20"/>
+          <w:lang w:eastAsia="zh-CN"/>
+        </w:rPr>
+        <w:t>break ties in case of equal sales</w:t>
+      </w:r>
+      <w:r>
+        <w:rPr>
+          <w:rFonts w:hint="eastAsia"/>
+          <w:sz w:val="20"/>
+          <w:szCs w:val="20"/>
+          <w:lang w:eastAsia="zh-CN"/>
+        </w:rPr>
+        <w:t xml:space="preserve"> by the hour, by adding a second layer ASC sorting on Hour after DSC sorting by </w:t>
+      </w:r>
+      <w:r>
+        <w:rPr>
+          <w:sz w:val="20"/>
+          <w:szCs w:val="20"/>
+          <w:lang w:eastAsia="zh-CN"/>
+        </w:rPr>
+        <w:t>‘</w:t>
+      </w:r>
+      <w:proofErr w:type="spellStart"/>
+      <w:r>
+        <w:rPr>
+          <w:sz w:val="20"/>
+          <w:szCs w:val="20"/>
+          <w:lang w:eastAsia="zh-CN"/>
+        </w:rPr>
+        <w:t>total_quantity_sold</w:t>
+      </w:r>
+      <w:proofErr w:type="spellEnd"/>
+      <w:r>
+        <w:rPr>
+          <w:sz w:val="20"/>
+          <w:szCs w:val="20"/>
+          <w:lang w:eastAsia="zh-CN"/>
+        </w:rPr>
+        <w:t>’</w:t>
+      </w:r>
+      <w:r>
+        <w:rPr>
+          <w:rFonts w:hint="eastAsia"/>
+          <w:sz w:val="20"/>
+          <w:szCs w:val="20"/>
+          <w:lang w:eastAsia="zh-CN"/>
+        </w:rPr>
+        <w:t xml:space="preserve"> </w:t>
+      </w:r>
+    </w:p>
+    <w:p>
+      <w:pPr>
+        <w:rPr>
+          <w:sz w:val="20"/>
+          <w:szCs w:val="20"/>
+          <w:lang w:eastAsia="zh-CN"/>
+        </w:rPr>
+      </w:pPr>
+    </w:p>
+    <w:p>
+      <w:pPr>
+        <w:rPr>
+          <w:rFonts w:hint="eastAsia"/>
+          <w:sz w:val="20"/>
+          <w:szCs w:val="20"/>
+          <w:lang w:eastAsia="zh-CN"/>
+        </w:rPr>
+      </w:pPr>
+    </w:p>
+    <w:p>
+      <w:pPr>
+        <w:rPr>
+          <w:sz w:val="20"/>
+          <w:szCs w:val="20"/>
         </w:rPr>
       </w:pPr>
     </w:p>
@@ -1162,6 +1252,7 @@
           <w:sz w:val="20"/>
           <w:szCs w:val="20"/>
         </w:rPr>
+        <w:lastRenderedPageBreak/>
         <w:t xml:space="preserve">Question </w:t>
       </w:r>
       <w:proofErr w:type="gramStart"/>
@@ -1233,7 +1324,6 @@
           <w:sz w:val="20"/>
           <w:szCs w:val="20"/>
         </w:rPr>
-        <w:lastRenderedPageBreak/>
         <w:t xml:space="preserve">We </w:t>
       </w:r>
       <w:r>
@@ -1736,6 +1826,7 @@
           <w:sz w:val="20"/>
           <w:szCs w:val="20"/>
         </w:rPr>
+        <w:lastRenderedPageBreak/>
         <w:t xml:space="preserve">With a bit of French translation, the word “COUPE” means “cut” as in cutting the bread. This makes sense it a “COUPE” was tipped after each bread article the customer requested to have cut, and the 0.15 price makes sense as well, echoing our previous interpretation about the aggregation mechanism of the tipping system and the tipping order of an “article” (or rather a service) such as “coupe”. </w:t>
       </w:r>
     </w:p>
@@ -1751,7 +1842,6 @@
           <w:sz w:val="20"/>
           <w:szCs w:val="20"/>
         </w:rPr>
-        <w:lastRenderedPageBreak/>
         <w:t xml:space="preserve">The remaining 351 records aren’t too big a deal over 2 years of data, it makes sense a customer might add (and the cashier would tip) a </w:t>
       </w:r>
       <w:proofErr w:type="gramStart"/>
@@ -2336,7 +2426,7 @@
   <w:docDefaults>
     <w:rPrDefault>
       <w:rPr>
-        <w:rFonts w:asciiTheme="minorHAnsi" w:eastAsiaTheme="minorHAnsi" w:hAnsiTheme="minorHAnsi" w:cstheme="minorBidi"/>
+        <w:rFonts w:asciiTheme="minorHAnsi" w:eastAsia="SimSun" w:hAnsiTheme="minorHAnsi" w:cstheme="minorBidi"/>
         <w:kern w:val="2"/>
         <w:sz w:val="24"/>
         <w:szCs w:val="24"/>

</xml_diff>